<commit_message>
auto: generate lecture docx (2026-04-28 23:07 KST)
</commit_message>
<xml_diff>
--- a/outputs/2026-04-28_관심사업.docx
+++ b/outputs/2026-04-28_관심사업.docx
@@ -82,6 +82,64 @@
     </w:p>
     <w:p>
       <w:pPr>
+        <w:spacing w:line="360" w:lineRule="auto" w:before="0" w:after="120"/>
+      </w:pPr>
+      <w:r>
+        <w:rPr>
+          <w:rFonts w:ascii="Arial" w:hAnsi="Arial" w:eastAsia="맑은 고딕" w:cs="Arial"/>
+          <w:b w:val="0"/>
+          <w:sz w:val="22"/>
+        </w:rPr>
+        <w:t>🎯 이번 편 주제 : 우리 기관 사업 중에 관심 있는 것과 그 이유는?</w:t>
+      </w:r>
+    </w:p>
+    <w:p>
+      <w:pPr>
+        <w:spacing w:line="360" w:lineRule="auto" w:before="0" w:after="120"/>
+      </w:pPr>
+      <w:r>
+        <w:rPr>
+          <w:rFonts w:ascii="Arial" w:hAnsi="Arial" w:eastAsia="맑은 고딕" w:cs="Arial"/>
+          <w:b w:val="0"/>
+          <w:sz w:val="22"/>
+        </w:rPr>
+        <w:t>여러분, 이 질문 정말 단골입니다. 그런데 막상 답변을 해보면, 두 가지 패턴으로 갈립니다. 첫째, 기관 홈페이지에 적힌 사업명을 줄줄 외워서 나열하는 경우. 둘째, "최근 뉴스에서 봤습니다" 정도로 두루뭉술하게 넘어가는 경우. 둘 다 면접관 입장에서는 "이 지원자는 우리 기관을 깊이 들여다보지 않았구나"로 읽힙니다.</w:t>
+      </w:r>
+    </w:p>
+    <w:p>
+      <w:pPr>
+        <w:spacing w:line="360" w:lineRule="auto" w:before="0" w:after="120"/>
+      </w:pPr>
+      <w:r>
+        <w:rPr>
+          <w:rFonts w:ascii="Arial" w:hAnsi="Arial" w:eastAsia="맑은 고딕" w:cs="Arial"/>
+          <w:b w:val="0"/>
+          <w:sz w:val="22"/>
+        </w:rPr>
+        <w:t>이 질문은 단순히 사업 하나를 고르는 문제가 아닙니다. 여러분이 기관을 어떻게 해석했는가, 그리고 그 사업에 본인을 어떻게 연결할 수 있는가를 동시에 보여줘야 하는 질문입니다.</w:t>
+      </w:r>
+    </w:p>
+    <w:p>
+      <w:pPr>
+        <w:spacing w:line="240" w:lineRule="auto" w:before="0" w:after="0"/>
+      </w:pPr>
+    </w:p>
+    <w:p>
+      <w:pPr>
+        <w:spacing w:line="240" w:lineRule="auto" w:before="0" w:after="0"/>
+        <w:jc w:val="center"/>
+        <w:pBdr>
+          <w:bottom w:val="single" w:sz="8" w:space="1" w:color="888888"/>
+        </w:pBdr>
+      </w:pPr>
+    </w:p>
+    <w:p>
+      <w:pPr>
+        <w:spacing w:line="240" w:lineRule="auto" w:before="0" w:after="0"/>
+      </w:pPr>
+    </w:p>
+    <w:p>
+      <w:pPr>
         <w:spacing w:line="360" w:lineRule="auto" w:before="280" w:after="160"/>
       </w:pPr>
       <w:r>
@@ -90,7 +148,7 @@
           <w:b/>
           <w:sz w:val="24"/>
         </w:rPr>
-        <w:t>🎯 들어가며 - 이 질문은 "기관 이해도"의 끝판왕입니다</w:t>
+        <w:t>📌 어떤 사업을 선택해야 하는가 - 3가지 기준</w:t>
       </w:r>
     </w:p>
     <w:p>
@@ -103,7 +161,20 @@
           <w:b w:val="0"/>
           <w:sz w:val="22"/>
         </w:rPr>
-        <w:t>여러분, 공기업 면접에서 "우리 기관 사업 중에 어떤 것에 관심 있나요?" 라는 질문을 받았을 때, 머릿속이 하얘지신 적 없으십니까. 홈페이지에서 본 사업명을 그냥 던지자니 너무 단편적이고, 그렇다고 어려운 사업을 골랐다가 꼬리질문에서 막히면 어떡하나 걱정되시지요.</w:t>
+        <w:t>관심 사업을 고를 때 기준 없이 그냥 "끌리는 것"으로 고르면 답변이 흔들립니다. 다음 3가지 기준 중 최소 2가지는 충족하는 사업을 고르시기 바랍니다.</w:t>
+      </w:r>
+    </w:p>
+    <w:p>
+      <w:pPr>
+        <w:spacing w:line="360" w:lineRule="auto" w:before="280" w:after="160"/>
+      </w:pPr>
+      <w:r>
+        <w:rPr>
+          <w:rFonts w:ascii="Arial" w:hAnsi="Arial" w:eastAsia="맑은 고딕" w:cs="Arial"/>
+          <w:b/>
+          <w:sz w:val="24"/>
+        </w:rPr>
+        <w:t>🔍 기준 1) 기관이 현재 가장 중요하게 생각하는 사업인가</w:t>
       </w:r>
     </w:p>
     <w:p>
@@ -116,13 +187,22 @@
           <w:b w:val="0"/>
           <w:sz w:val="22"/>
         </w:rPr>
-        <w:t>이 질문은 단순히 "사업 이름 하나 외워왔니"를 묻는 게 아닙니다. 면접관이 진짜 보고 싶은 것은 세 가지입니다.</w:t>
+        <w:t>이걸 어떻게 찾는가, 이 부분이 핵심입니다. 단순히 기관 홈페이지 메인 배너만 보면 안 됩니다.</w:t>
       </w:r>
     </w:p>
     <w:p>
       <w:pPr>
+        <w:spacing w:line="240" w:lineRule="auto" w:before="0" w:after="0"/>
+      </w:pPr>
+    </w:p>
+    <w:p>
+      <w:pPr>
         <w:spacing w:line="360" w:lineRule="auto" w:before="0" w:after="80"/>
-        <w:ind w:left="340"/>
+        <w:ind w:left="454"/>
+        <w:pBdr>
+          <w:left w:val="single" w:sz="18" w:space="10" w:color="888888"/>
+        </w:pBdr>
+        <w:shd w:val="clear" w:color="auto" w:fill="F2F2F2"/>
       </w:pPr>
       <w:r>
         <w:rPr>
@@ -130,490 +210,7 @@
           <w:b w:val="0"/>
           <w:sz w:val="22"/>
         </w:rPr>
-        <w:t>• 우리 기관 사업 구조를 제대로 파악하고 왔는가</w:t>
-      </w:r>
-    </w:p>
-    <w:p>
-      <w:pPr>
-        <w:spacing w:line="360" w:lineRule="auto" w:before="0" w:after="80"/>
-        <w:ind w:left="340"/>
-      </w:pPr>
-      <w:r>
-        <w:rPr>
-          <w:rFonts w:ascii="Arial" w:hAnsi="Arial" w:eastAsia="맑은 고딕" w:cs="Arial"/>
-          <w:b w:val="0"/>
-          <w:sz w:val="22"/>
-        </w:rPr>
-        <w:t>• 본인 경험과 우리 기관 사업을 연결할 수 있는 사람인가</w:t>
-      </w:r>
-    </w:p>
-    <w:p>
-      <w:pPr>
-        <w:spacing w:line="360" w:lineRule="auto" w:before="0" w:after="80"/>
-        <w:ind w:left="340"/>
-      </w:pPr>
-      <w:r>
-        <w:rPr>
-          <w:rFonts w:ascii="Arial" w:hAnsi="Arial" w:eastAsia="맑은 고딕" w:cs="Arial"/>
-          <w:b w:val="0"/>
-          <w:sz w:val="22"/>
-        </w:rPr>
-        <w:t>• 입사 후 어디서 어떻게 기여할지 그림이 그려져 있는가</w:t>
-      </w:r>
-    </w:p>
-    <w:p>
-      <w:pPr>
-        <w:spacing w:line="360" w:lineRule="auto" w:before="0" w:after="120"/>
-      </w:pPr>
-      <w:r>
-        <w:rPr>
-          <w:rFonts w:ascii="Arial" w:hAnsi="Arial" w:eastAsia="맑은 고딕" w:cs="Arial"/>
-          <w:b w:val="0"/>
-          <w:sz w:val="22"/>
-        </w:rPr>
-        <w:t>이번 편에서는 "어떤 사업을 골라야 하는가" 부터 "왜 그 사업에 관심 있다고 말해야 하는가", 그리고 "어떤 프레임으로 답변해야 하는가" 까지 한 번에 정리해드리겠습니다.</w:t>
-      </w:r>
-    </w:p>
-    <w:p>
-      <w:pPr>
-        <w:spacing w:line="240" w:lineRule="auto" w:before="0" w:after="0"/>
-      </w:pPr>
-    </w:p>
-    <w:p>
-      <w:pPr>
-        <w:spacing w:line="240" w:lineRule="auto" w:before="0" w:after="0"/>
-        <w:jc w:val="center"/>
-        <w:pBdr>
-          <w:bottom w:val="single" w:sz="8" w:space="1" w:color="888888"/>
-        </w:pBdr>
-      </w:pPr>
-    </w:p>
-    <w:p>
-      <w:pPr>
-        <w:spacing w:line="240" w:lineRule="auto" w:before="0" w:after="0"/>
-      </w:pPr>
-    </w:p>
-    <w:p>
-      <w:pPr>
-        <w:spacing w:line="360" w:lineRule="auto" w:before="280" w:after="160"/>
-      </w:pPr>
-      <w:r>
-        <w:rPr>
-          <w:rFonts w:ascii="Arial" w:hAnsi="Arial" w:eastAsia="맑은 고딕" w:cs="Arial"/>
-          <w:b/>
-          <w:sz w:val="24"/>
-        </w:rPr>
-        <w:t>🔍 1단계 - 어떤 사업을 골라야 하는가</w:t>
-      </w:r>
-    </w:p>
-    <w:p>
-      <w:pPr>
-        <w:spacing w:line="360" w:lineRule="auto" w:before="0" w:after="120"/>
-      </w:pPr>
-      <w:r>
-        <w:rPr>
-          <w:rFonts w:ascii="Arial" w:hAnsi="Arial" w:eastAsia="맑은 고딕" w:cs="Arial"/>
-          <w:b w:val="0"/>
-          <w:sz w:val="22"/>
-        </w:rPr>
-        <w:t>가장 많은 분들이 실수하시는 부분이 여기서부터입니다. "내 눈에 멋있어 보이는 사업", "뉴스에 많이 나온 사업"을 그냥 고르시는 경우가 많습니다. 그러면 답변이 공허해집니다.</w:t>
-      </w:r>
-    </w:p>
-    <w:p>
-      <w:pPr>
-        <w:spacing w:line="360" w:lineRule="auto" w:before="0" w:after="120"/>
-      </w:pPr>
-      <w:r>
-        <w:rPr>
-          <w:rFonts w:ascii="Arial" w:hAnsi="Arial" w:eastAsia="맑은 고딕" w:cs="Arial"/>
-          <w:b w:val="0"/>
-          <w:sz w:val="22"/>
-        </w:rPr>
-        <w:t>다음 세 가지 기준 중 최소 두 가지 이상을 충족하는 사업을 고르시기 바랍니다.</w:t>
-      </w:r>
-    </w:p>
-    <w:p>
-      <w:pPr>
-        <w:spacing w:line="360" w:lineRule="auto" w:before="0" w:after="120"/>
-      </w:pPr>
-      <w:r>
-        <w:rPr>
-          <w:rFonts w:ascii="Arial" w:hAnsi="Arial" w:eastAsia="맑은 고딕" w:cs="Arial"/>
-          <w:b w:val="0"/>
-          <w:sz w:val="22"/>
-        </w:rPr>
-        <w:t>#### 📌 기준 1) 기관이 현재 가장 중요하게 생각하는 사업인가</w:t>
-      </w:r>
-    </w:p>
-    <w:p>
-      <w:pPr>
-        <w:spacing w:line="360" w:lineRule="auto" w:before="0" w:after="120"/>
-      </w:pPr>
-      <w:r>
-        <w:rPr>
-          <w:rFonts w:ascii="Arial" w:hAnsi="Arial" w:eastAsia="맑은 고딕" w:cs="Arial"/>
-          <w:b w:val="0"/>
-          <w:sz w:val="22"/>
-        </w:rPr>
-        <w:t>여러분이 좋아하는 사업이 아니라, 기관이 좋아하는 사업을 고르셔야 합니다. 그래야 면접관이 고개를 끄덕입니다. 어디서 찾으시면 됩니까.</w:t>
-      </w:r>
-    </w:p>
-    <w:p>
-      <w:pPr>
-        <w:spacing w:line="360" w:lineRule="auto" w:before="0" w:after="80"/>
-        <w:ind w:left="340"/>
-      </w:pPr>
-      <w:r>
-        <w:rPr>
-          <w:rFonts w:ascii="Arial" w:hAnsi="Arial" w:eastAsia="맑은 고딕" w:cs="Arial"/>
-          <w:b w:val="0"/>
-          <w:sz w:val="22"/>
-        </w:rPr>
-        <w:t>• 알리오(공공기관 경영정보 공개시스템) - 중장기 경영목표 / 핵심사업</w:t>
-      </w:r>
-    </w:p>
-    <w:p>
-      <w:pPr>
-        <w:spacing w:line="360" w:lineRule="auto" w:before="0" w:after="80"/>
-        <w:ind w:left="340"/>
-      </w:pPr>
-      <w:r>
-        <w:rPr>
-          <w:rFonts w:ascii="Arial" w:hAnsi="Arial" w:eastAsia="맑은 고딕" w:cs="Arial"/>
-          <w:b w:val="0"/>
-          <w:sz w:val="22"/>
-        </w:rPr>
-        <w:t>• 기관 홈페이지 경영공시 - 연간 사업계획서, 경영성과 보고서</w:t>
-      </w:r>
-    </w:p>
-    <w:p>
-      <w:pPr>
-        <w:spacing w:line="360" w:lineRule="auto" w:before="0" w:after="80"/>
-        <w:ind w:left="340"/>
-      </w:pPr>
-      <w:r>
-        <w:rPr>
-          <w:rFonts w:ascii="Arial" w:hAnsi="Arial" w:eastAsia="맑은 고딕" w:cs="Arial"/>
-          <w:b w:val="0"/>
-          <w:sz w:val="22"/>
-        </w:rPr>
-        <w:t>• 기관장 취임사 / 신년사 - 강조하는 방향성</w:t>
-      </w:r>
-    </w:p>
-    <w:p>
-      <w:pPr>
-        <w:spacing w:line="360" w:lineRule="auto" w:before="0" w:after="80"/>
-        <w:ind w:left="340"/>
-      </w:pPr>
-      <w:r>
-        <w:rPr>
-          <w:rFonts w:ascii="Arial" w:hAnsi="Arial" w:eastAsia="맑은 고딕" w:cs="Arial"/>
-          <w:b w:val="0"/>
-          <w:sz w:val="22"/>
-        </w:rPr>
-        <w:t>• 최근 1년치 보도자료 - 자주 등장하는 키워드</w:t>
-      </w:r>
-    </w:p>
-    <w:p>
-      <w:pPr>
-        <w:spacing w:line="360" w:lineRule="auto" w:before="0" w:after="120"/>
-      </w:pPr>
-      <w:r>
-        <w:rPr>
-          <w:rFonts w:ascii="Arial" w:hAnsi="Arial" w:eastAsia="맑은 고딕" w:cs="Arial"/>
-          <w:b w:val="0"/>
-          <w:sz w:val="22"/>
-        </w:rPr>
-        <w:t>이 네 곳에서 공통적으로 등장하는 사업이 그 기관의 "현재 핵심 사업" 입니다. 이게 첫 번째 기준입니다.</w:t>
-      </w:r>
-    </w:p>
-    <w:p>
-      <w:pPr>
-        <w:spacing w:line="360" w:lineRule="auto" w:before="0" w:after="120"/>
-      </w:pPr>
-      <w:r>
-        <w:rPr>
-          <w:rFonts w:ascii="Arial" w:hAnsi="Arial" w:eastAsia="맑은 고딕" w:cs="Arial"/>
-          <w:b w:val="0"/>
-          <w:sz w:val="22"/>
-        </w:rPr>
-        <w:t>#### 📌 기준 2) 사회 문제/이슈 해결에 중요한 사업인가</w:t>
-      </w:r>
-    </w:p>
-    <w:p>
-      <w:pPr>
-        <w:spacing w:line="360" w:lineRule="auto" w:before="0" w:after="120"/>
-      </w:pPr>
-      <w:r>
-        <w:rPr>
-          <w:rFonts w:ascii="Arial" w:hAnsi="Arial" w:eastAsia="맑은 고딕" w:cs="Arial"/>
-          <w:b w:val="0"/>
-          <w:sz w:val="22"/>
-        </w:rPr>
-        <w:t>같은 사업이라도 "왜 이 사업이 사회적으로 중요한가" 를 본인 언어로 말할 수 있어야 합니다. 예를 들어 한국토지주택공사의 매입임대주택 사업을 고른다면, 단순히 "주거 복지 사업이라서" 가 아니라 "1\~2인 청년 가구 증가, 전세사기 문제, 주거 사다리 단절이라는 사회 이슈 속에서 가장 직접적인 해결책이라서" 라고 말할 수 있어야 한다는 뜻입니다.</w:t>
-      </w:r>
-    </w:p>
-    <w:p>
-      <w:pPr>
-        <w:spacing w:line="360" w:lineRule="auto" w:before="0" w:after="120"/>
-      </w:pPr>
-      <w:r>
-        <w:rPr>
-          <w:rFonts w:ascii="Arial" w:hAnsi="Arial" w:eastAsia="맑은 고딕" w:cs="Arial"/>
-          <w:b w:val="0"/>
-          <w:sz w:val="22"/>
-        </w:rPr>
-        <w:t>#### 📌 기준 3) 본인 경험과 연결고리가 자연스러운가</w:t>
-      </w:r>
-    </w:p>
-    <w:p>
-      <w:pPr>
-        <w:spacing w:line="360" w:lineRule="auto" w:before="0" w:after="120"/>
-      </w:pPr>
-      <w:r>
-        <w:rPr>
-          <w:rFonts w:ascii="Arial" w:hAnsi="Arial" w:eastAsia="맑은 고딕" w:cs="Arial"/>
-          <w:b w:val="0"/>
-          <w:sz w:val="22"/>
-        </w:rPr>
-        <w:t>이 부분이 합격자와 불합격자를 가르는 핵심입니다. 아무리 멋있는 사업을 골라도, 본인 경험과 연결이 안 되면 "왜 그 사업에 관심 있는지" 가 공허해집니다. 반대로 작은 경험이라도 자연스럽게 연결되면 답변이 살아납니다.</w:t>
-      </w:r>
-    </w:p>
-    <w:p>
-      <w:pPr>
-        <w:spacing w:line="240" w:lineRule="auto" w:before="0" w:after="0"/>
-      </w:pPr>
-    </w:p>
-    <w:p>
-      <w:pPr>
-        <w:spacing w:line="360" w:lineRule="auto" w:before="0" w:after="80"/>
-        <w:ind w:left="454"/>
-        <w:pBdr>
-          <w:left w:val="single" w:sz="18" w:space="10" w:color="888888"/>
-        </w:pBdr>
-        <w:shd w:val="clear" w:color="auto" w:fill="F2F2F2"/>
-      </w:pPr>
-      <w:r>
-        <w:rPr>
-          <w:rFonts w:ascii="Arial" w:hAnsi="Arial" w:eastAsia="맑은 고딕" w:cs="Arial"/>
-          <w:b w:val="0"/>
-          <w:sz w:val="22"/>
-        </w:rPr>
-        <w:t>⭕️ 좋은 예 : "대학 시절 농촌 봉사활동에서 고령 어르신들의 디지털 소외를 직접 본 경험이 있어, 한국전력공사의 에너지 취약계층 지원 사업에 관심을 갖게 되었습니다."</w:t>
-      </w:r>
-    </w:p>
-    <w:p>
-      <w:pPr>
-        <w:spacing w:line="240" w:lineRule="auto" w:before="0" w:after="0"/>
-      </w:pPr>
-    </w:p>
-    <w:p>
-      <w:pPr>
-        <w:spacing w:line="240" w:lineRule="auto" w:before="0" w:after="0"/>
-      </w:pPr>
-    </w:p>
-    <w:p>
-      <w:pPr>
-        <w:spacing w:line="360" w:lineRule="auto" w:before="0" w:after="80"/>
-        <w:ind w:left="454"/>
-        <w:pBdr>
-          <w:left w:val="single" w:sz="18" w:space="10" w:color="888888"/>
-        </w:pBdr>
-        <w:shd w:val="clear" w:color="auto" w:fill="F2F2F2"/>
-      </w:pPr>
-      <w:r>
-        <w:rPr>
-          <w:rFonts w:ascii="Arial" w:hAnsi="Arial" w:eastAsia="맑은 고딕" w:cs="Arial"/>
-          <w:b w:val="0"/>
-          <w:sz w:val="22"/>
-        </w:rPr>
-        <w:t>❌ 나쁜 예 : "한국전력공사의 신재생에너지 사업이 미래 산업이라 관심 있습니다." (경험 연결 없음, 누구나 할 수 있는 답변)</w:t>
-      </w:r>
-    </w:p>
-    <w:p>
-      <w:pPr>
-        <w:spacing w:line="240" w:lineRule="auto" w:before="0" w:after="0"/>
-      </w:pPr>
-    </w:p>
-    <w:p>
-      <w:pPr>
-        <w:spacing w:line="360" w:lineRule="auto" w:before="0" w:after="120"/>
-      </w:pPr>
-      <w:r>
-        <w:rPr>
-          <w:rFonts w:ascii="Arial" w:hAnsi="Arial" w:eastAsia="맑은 고딕" w:cs="Arial"/>
-          <w:b w:val="0"/>
-          <w:sz w:val="22"/>
-        </w:rPr>
-        <w:t>세 가지 기준을 정리하면, 사업을 고를 때는 "기관 핵심 사업 + 사회적 의의 + 본인 경험 연결" 이 셋이 만나는 지점을 찾으시는 것이 가장 안전합니다.</w:t>
-      </w:r>
-    </w:p>
-    <w:p>
-      <w:pPr>
-        <w:spacing w:line="240" w:lineRule="auto" w:before="0" w:after="0"/>
-      </w:pPr>
-    </w:p>
-    <w:p>
-      <w:pPr>
-        <w:spacing w:line="240" w:lineRule="auto" w:before="0" w:after="0"/>
-        <w:jc w:val="center"/>
-        <w:pBdr>
-          <w:bottom w:val="single" w:sz="8" w:space="1" w:color="888888"/>
-        </w:pBdr>
-      </w:pPr>
-    </w:p>
-    <w:p>
-      <w:pPr>
-        <w:spacing w:line="240" w:lineRule="auto" w:before="0" w:after="0"/>
-      </w:pPr>
-    </w:p>
-    <w:p>
-      <w:pPr>
-        <w:spacing w:line="360" w:lineRule="auto" w:before="280" w:after="160"/>
-      </w:pPr>
-      <w:r>
-        <w:rPr>
-          <w:rFonts w:ascii="Arial" w:hAnsi="Arial" w:eastAsia="맑은 고딕" w:cs="Arial"/>
-          <w:b/>
-          <w:sz w:val="24"/>
-        </w:rPr>
-        <w:t>🧩 2단계 - 왜 관심 있는지 "이유"는 어떻게 만드는가</w:t>
-      </w:r>
-    </w:p>
-    <w:p>
-      <w:pPr>
-        <w:spacing w:line="360" w:lineRule="auto" w:before="0" w:after="120"/>
-      </w:pPr>
-      <w:r>
-        <w:rPr>
-          <w:rFonts w:ascii="Arial" w:hAnsi="Arial" w:eastAsia="맑은 고딕" w:cs="Arial"/>
-          <w:b w:val="0"/>
-          <w:sz w:val="22"/>
-        </w:rPr>
-        <w:t>사업을 골랐다면, 이제 "왜 이 사업에 관심이 있는가" 라는 이유를 만들어야 합니다. 이유는 다음 세 가지 관점 중에서 가져오시면 됩니다.</w:t>
-      </w:r>
-    </w:p>
-    <w:p>
-      <w:pPr>
-        <w:spacing w:line="360" w:lineRule="auto" w:before="0" w:after="80"/>
-        <w:ind w:left="340"/>
-      </w:pPr>
-      <w:r>
-        <w:rPr>
-          <w:rFonts w:ascii="Arial" w:hAnsi="Arial" w:eastAsia="맑은 고딕" w:cs="Arial"/>
-          <w:b w:val="0"/>
-          <w:sz w:val="22"/>
-        </w:rPr>
-        <w:t>• 본인 경험 관점 : 직접 겪었거나 본 경험에서 자연스럽게 관심이 생긴 경우</w:t>
-      </w:r>
-    </w:p>
-    <w:p>
-      <w:pPr>
-        <w:spacing w:line="360" w:lineRule="auto" w:before="0" w:after="80"/>
-        <w:ind w:left="340"/>
-      </w:pPr>
-      <w:r>
-        <w:rPr>
-          <w:rFonts w:ascii="Arial" w:hAnsi="Arial" w:eastAsia="맑은 고딕" w:cs="Arial"/>
-          <w:b w:val="0"/>
-          <w:sz w:val="22"/>
-        </w:rPr>
-        <w:t>• 기관 관점 : 기관이 현재 가장 역량을 집중하고 있는 사업이라서</w:t>
-      </w:r>
-    </w:p>
-    <w:p>
-      <w:pPr>
-        <w:spacing w:line="360" w:lineRule="auto" w:before="0" w:after="80"/>
-        <w:ind w:left="340"/>
-      </w:pPr>
-      <w:r>
-        <w:rPr>
-          <w:rFonts w:ascii="Arial" w:hAnsi="Arial" w:eastAsia="맑은 고딕" w:cs="Arial"/>
-          <w:b w:val="0"/>
-          <w:sz w:val="22"/>
-        </w:rPr>
-        <w:t>• 사회 문제 관점 : 현재 사회 이슈 해결에 중요한 사업이라고 판단해서</w:t>
-      </w:r>
-    </w:p>
-    <w:p>
-      <w:pPr>
-        <w:spacing w:line="360" w:lineRule="auto" w:before="0" w:after="120"/>
-      </w:pPr>
-      <w:r>
-        <w:rPr>
-          <w:rFonts w:ascii="Arial" w:hAnsi="Arial" w:eastAsia="맑은 고딕" w:cs="Arial"/>
-          <w:b w:val="0"/>
-          <w:sz w:val="22"/>
-        </w:rPr>
-        <w:t>가장 강력한 답변은 이 세 가지 관점을 두 개 이상 엮는 답변입니다. "본인 경험 + 사회 문제" 또는 "본인 경험 + 기관 방향성" 처럼 묶으시면 답변에 입체감이 생깁니다.</w:t>
-      </w:r>
-    </w:p>
-    <w:p>
-      <w:pPr>
-        <w:spacing w:line="240" w:lineRule="auto" w:before="0" w:after="0"/>
-      </w:pPr>
-    </w:p>
-    <w:p>
-      <w:pPr>
-        <w:spacing w:line="240" w:lineRule="auto" w:before="0" w:after="0"/>
-        <w:jc w:val="center"/>
-        <w:pBdr>
-          <w:bottom w:val="single" w:sz="8" w:space="1" w:color="888888"/>
-        </w:pBdr>
-      </w:pPr>
-    </w:p>
-    <w:p>
-      <w:pPr>
-        <w:spacing w:line="240" w:lineRule="auto" w:before="0" w:after="0"/>
-      </w:pPr>
-    </w:p>
-    <w:p>
-      <w:pPr>
-        <w:spacing w:line="360" w:lineRule="auto" w:before="280" w:after="160"/>
-      </w:pPr>
-      <w:r>
-        <w:rPr>
-          <w:rFonts w:ascii="Arial" w:hAnsi="Arial" w:eastAsia="맑은 고딕" w:cs="Arial"/>
-          <w:b/>
-          <w:sz w:val="24"/>
-        </w:rPr>
-        <w:t>🏗️ 3단계 - 답변 프레임 (3단 구조)</w:t>
-      </w:r>
-    </w:p>
-    <w:p>
-      <w:pPr>
-        <w:spacing w:line="360" w:lineRule="auto" w:before="0" w:after="120"/>
-      </w:pPr>
-      <w:r>
-        <w:rPr>
-          <w:rFonts w:ascii="Arial" w:hAnsi="Arial" w:eastAsia="맑은 고딕" w:cs="Arial"/>
-          <w:b w:val="0"/>
-          <w:sz w:val="22"/>
-        </w:rPr>
-        <w:t>이제 본격적으로 답변 프레임을 알려드리겠습니다. 이 질문은 두괄식 + 근거 + 기여 의 3단 구조로 가시면 됩니다.</w:t>
-      </w:r>
-    </w:p>
-    <w:p>
-      <w:pPr>
-        <w:spacing w:line="240" w:lineRule="auto" w:before="0" w:after="0"/>
-      </w:pPr>
-    </w:p>
-    <w:p>
-      <w:pPr>
-        <w:spacing w:line="360" w:lineRule="auto" w:before="0" w:after="80"/>
-        <w:ind w:left="454"/>
-        <w:pBdr>
-          <w:left w:val="single" w:sz="18" w:space="10" w:color="888888"/>
-        </w:pBdr>
-        <w:shd w:val="clear" w:color="auto" w:fill="F2F2F2"/>
-      </w:pPr>
-      <w:r>
-        <w:rPr>
-          <w:rFonts w:ascii="Arial" w:hAnsi="Arial" w:eastAsia="맑은 고딕" w:cs="Arial"/>
-          <w:b w:val="0"/>
-          <w:sz w:val="22"/>
-        </w:rPr>
-        <w:t>1단계 \[두괄식] : "저는 ㅇㅇ 사업에 가장 관심이 있습니다."</w:t>
+        <w:t>첫째, 기관의 중장기 경영 목표 또는 중장기 계획에 명시된 핵심 사업을 확인합니다. 보통 5개년 계획 형태로 공개되어 있고, 알리오(공공기관 경영정보 공개시스템)의 경영 공시 항목에서 직접 확인할 수 있습니다.</w:t>
       </w:r>
     </w:p>
     <w:p>
@@ -648,7 +245,7 @@
           <w:b w:val="0"/>
           <w:sz w:val="22"/>
         </w:rPr>
-        <w:t>2단계 \[근거] : 왜 이 사업에 관심 있는지 (경험 / 기관 방향성 / 사회 이슈 중 1\~2개)</w:t>
+        <w:t>둘째, 기관장 취임사와 신년사를 읽으시기 바랍니다. 거기에 강조된 방향성과 일치하는 사업이 곧 그 해 그 기관의 우선순위 사업입니다.</w:t>
       </w:r>
     </w:p>
     <w:p>
@@ -683,13 +280,26 @@
           <w:b w:val="0"/>
           <w:sz w:val="22"/>
         </w:rPr>
-        <w:t>3단계 \[기여] : 본인이 어떤 점에서 어떻게 기여하고 싶은지 구체적으로</w:t>
+        <w:t>셋째, 최근 1년간 기관 보도자료에서 반복적으로 등장하는 사업명을 체크합니다. 빈도수가 높을수록 기관이 힘을 싣고 있는 사업입니다.</w:t>
       </w:r>
     </w:p>
     <w:p>
       <w:pPr>
         <w:spacing w:line="240" w:lineRule="auto" w:before="0" w:after="0"/>
       </w:pPr>
+    </w:p>
+    <w:p>
+      <w:pPr>
+        <w:spacing w:line="360" w:lineRule="auto" w:before="280" w:after="160"/>
+      </w:pPr>
+      <w:r>
+        <w:rPr>
+          <w:rFonts w:ascii="Arial" w:hAnsi="Arial" w:eastAsia="맑은 고딕" w:cs="Arial"/>
+          <w:b/>
+          <w:sz w:val="24"/>
+        </w:rPr>
+        <w:t>🔍 기준 2) 현재 사회 문제, 사회 이슈 해결에 중요한 사업이라고 본인이 판단하는가</w:t>
+      </w:r>
     </w:p>
     <w:p>
       <w:pPr>
@@ -701,27 +311,8 @@
           <w:b w:val="0"/>
           <w:sz w:val="22"/>
         </w:rPr>
-        <w:t>여기서 중요한 포인트는 3단계 "기여" 부분입니다. "배우고 싶다", "성장하고 싶다", "적응하겠다" 로 끝나면 절대 안 됩니다. "ㅇㅇ를 보태겠다", "ㅇㅇ에 기여하겠다", "ㅇㅇ를 수행하고 싶다" 로 마무리하셔야 합니다.</w:t>
+        <w:t>공기업 면접에서는 "이 사업이 왜 지금 사회적으로 필요한가"에 대한 본인의 관점을 보여주는 것이 중요합니다. 기관의 사업이 어떤 사회 문제, 어떤 국민의 어려움과 연결되어 있는지를 본인 언어로 설명할 수 있어야 합니다.</w:t>
       </w:r>
-    </w:p>
-    <w:p>
-      <w:pPr>
-        <w:spacing w:line="240" w:lineRule="auto" w:before="0" w:after="0"/>
-      </w:pPr>
-    </w:p>
-    <w:p>
-      <w:pPr>
-        <w:spacing w:line="240" w:lineRule="auto" w:before="0" w:after="0"/>
-        <w:jc w:val="center"/>
-        <w:pBdr>
-          <w:bottom w:val="single" w:sz="8" w:space="1" w:color="888888"/>
-        </w:pBdr>
-      </w:pPr>
-    </w:p>
-    <w:p>
-      <w:pPr>
-        <w:spacing w:line="240" w:lineRule="auto" w:before="0" w:after="0"/>
-      </w:pPr>
     </w:p>
     <w:p>
       <w:pPr>
@@ -733,7 +324,7 @@
           <w:b/>
           <w:sz w:val="24"/>
         </w:rPr>
-        <w:t>💡 4단계 - 답변 예시 (직군별/기관별)</w:t>
+        <w:t>🔍 기준 3) 본인 경험과 자연스럽게 연결고리가 만들어지는 사업인가</w:t>
       </w:r>
     </w:p>
     <w:p>
@@ -746,8 +337,27 @@
           <w:b w:val="0"/>
           <w:sz w:val="22"/>
         </w:rPr>
-        <w:t>이제 실제 답변 예시를 보여드리겠습니다. 다양한 기관, 다양한 직군, 다양한 출발 패턴으로 보여드릴 테니 본인 상황에 맞게 응용하시기 바랍니다.</w:t>
+        <w:t>이게 사실 가장 중요합니다. 아무리 기관이 강조하는 사업이라도, 본인 경험과 연결되지 않으면 답변이 공허해집니다. 반대로, 작은 경험이라도 사업의 본질과 닿아 있다면 그 답변은 살아납니다.</w:t>
       </w:r>
+    </w:p>
+    <w:p>
+      <w:pPr>
+        <w:spacing w:line="240" w:lineRule="auto" w:before="0" w:after="0"/>
+      </w:pPr>
+    </w:p>
+    <w:p>
+      <w:pPr>
+        <w:spacing w:line="240" w:lineRule="auto" w:before="0" w:after="0"/>
+        <w:jc w:val="center"/>
+        <w:pBdr>
+          <w:bottom w:val="single" w:sz="8" w:space="1" w:color="888888"/>
+        </w:pBdr>
+      </w:pPr>
+    </w:p>
+    <w:p>
+      <w:pPr>
+        <w:spacing w:line="240" w:lineRule="auto" w:before="0" w:after="0"/>
+      </w:pPr>
     </w:p>
     <w:p>
       <w:pPr>
@@ -759,7 +369,7 @@
           <w:b w:val="0"/>
           <w:sz w:val="22"/>
         </w:rPr>
-        <w:t>#### 예시 1) 한국토지주택공사 - 행정직 - 경험 출발형</w:t>
+        <w:t>📐 답변 프레임 - 이 순서대로 가시기 바랍니다</w:t>
       </w:r>
     </w:p>
     <w:p>
@@ -782,7 +392,7 @@
           <w:b w:val="0"/>
           <w:sz w:val="22"/>
         </w:rPr>
-        <w:t>저는 LH의 매입임대주택 공급 사업에 가장 관심이 있습니다.</w:t>
+        <w:t>1단계 [두괄식] : 저는 ㅇㅇ 사업에 가장 관심이 있습니다.</w:t>
       </w:r>
     </w:p>
     <w:p>
@@ -817,7 +427,7 @@
           <w:b w:val="0"/>
           <w:sz w:val="22"/>
         </w:rPr>
-        <w:t>대학 시절 주거 복지 분야 학회 활동 중, 청년 ㅇㅇ명을 인터뷰하며 전세사기 피해자와 보증금을 마련하지 못해 고시원으로 밀려난 사례를 직접 들은 적이 있습니다. 그때 청년 주거 사다리가 끊긴 현실을 체감했고, 이를 가장 직접적으로 메우는 사업이 매입임대주택이라고 생각하게 되었습니다. 특히 LH는 중장기 경영목표에서 청년·신혼·고령자 매입임대 공급 확대를 핵심 과제로 제시하고 있어, 사회적 필요와 기관의 방향성이 일치하는 사업이라고 보았습니다.</w:t>
+        <w:t>2단계 [근거] : 그 이유는 (1) 해당 기관이 현재 가장 힘을 싣고 있는 사업이고, (2) 현재 사회적으로 ㅇㅇ 문제 해결에 직결되며, (3) 제가 ㅇㅇ 경험을 통해 이 사업의 필요성을 직접 느꼈기 때문입니다.</w:t>
       </w:r>
     </w:p>
     <w:p>
@@ -852,7 +462,7 @@
           <w:b w:val="0"/>
           <w:sz w:val="22"/>
         </w:rPr>
-        <w:t>입사 후에는 매입 대상 주택 발굴 단계에서 행정 절차의 정확성과 신속성을 보태고 싶습니다. 학회에서 인터뷰 자료를 ㅇㅇ건 정리하며 키운 자료 분석 능력을 활용해, 수혜자가 한 명이라도 더 빨리 입주할 수 있도록 절차 효율화에 기여하겠습니다.</w:t>
+        <w:t>3단계 [기여] : 입사 후 저는 이 사업에 ㅇㅇ 측면에서 보태고 싶습니다.</w:t>
       </w:r>
     </w:p>
     <w:p>
@@ -870,7 +480,39 @@
           <w:b w:val="0"/>
           <w:sz w:val="22"/>
         </w:rPr>
-        <w:t>#### 예시 2) 한국전력공사 - 기술직 - 사회 이슈 출발형</w:t>
+        <w:t>이 3단 구조가 흔들리지 않으면 답변은 깔끔하게 떨어집니다. 다만 예시마다 첫 문장 출발점, 근거 배치 순서, 기여 표현 방식은 다양하게 가져가시기 바랍니다. 모든 답변이 똑같은 패턴으로 들리면 외운 답변처럼 들립니다.</w:t>
+      </w:r>
+    </w:p>
+    <w:p>
+      <w:pPr>
+        <w:spacing w:line="240" w:lineRule="auto" w:before="0" w:after="0"/>
+      </w:pPr>
+    </w:p>
+    <w:p>
+      <w:pPr>
+        <w:spacing w:line="240" w:lineRule="auto" w:before="0" w:after="0"/>
+        <w:jc w:val="center"/>
+        <w:pBdr>
+          <w:bottom w:val="single" w:sz="8" w:space="1" w:color="888888"/>
+        </w:pBdr>
+      </w:pPr>
+    </w:p>
+    <w:p>
+      <w:pPr>
+        <w:spacing w:line="240" w:lineRule="auto" w:before="0" w:after="0"/>
+      </w:pPr>
+    </w:p>
+    <w:p>
+      <w:pPr>
+        <w:spacing w:line="360" w:lineRule="auto" w:before="280" w:after="160"/>
+      </w:pPr>
+      <w:r>
+        <w:rPr>
+          <w:rFonts w:ascii="Arial" w:hAnsi="Arial" w:eastAsia="맑은 고딕" w:cs="Arial"/>
+          <w:b/>
+          <w:sz w:val="24"/>
+        </w:rPr>
+        <w:t>💡 답변 예시 - 직군별, 기관별로 다양하게</w:t>
       </w:r>
     </w:p>
     <w:p>
@@ -893,7 +535,7 @@
           <w:b w:val="0"/>
           <w:sz w:val="22"/>
         </w:rPr>
-        <w:t>한국전력공사의 사업 중 배전망 지능화 사업에 가장 관심이 큽니다.</w:t>
+        <w:t>예시 1) 한국전력공사 기술직 - 분산에너지 활성화 사업</w:t>
       </w:r>
     </w:p>
     <w:p>
@@ -928,7 +570,35 @@
           <w:b w:val="0"/>
           <w:sz w:val="22"/>
         </w:rPr>
-        <w:t>최근 폭염·한파의 빈도가 높아지면서 정전 사고가 사회 안전 문제로 직결되고 있습니다. 특히 ㅇㅇ년 강풍으로 인한 대규모 정전 사례에서 보듯, 기존 배전망의 한계가 명확히 드러났습니다. 한전이 중장기 계획에서 배전망 디지털 전환과 자가 복구 시스템 구축을 핵심 과제로 강조하고 있는 것도 같은 맥락이라고 이해하고 있습니다. 저는 대학에서 전력공학 전공으로 배전 시스템 시뮬레이션 프로젝트를 ㅇㅇ회 수행하며 이 분야의 기술적 흐름을 따라가고자 노력해왔습니다.</w:t>
+        <w:t>저는 한국전력공사 사업 중에서 분산에너지 활성화 사업에 가장 관심이 있습니다. 한전이 발표한 중장기 경영목표에서 에너지 신사업과 계통 안정화가 핵심 축으로 제시되어 있고, 신년사에서도 분산형 전원의 계통 수용성 확대가 반복적으로 강조되고 있다는 점에서 기관의 우선순위 사업이라고 판단했습니다. 동시에 재생에너지 보급은 늘어나는데 계통 연계 지연이 사회적 문제가 되고 있어, 국민의 전력 안정 공급이라는 공공성 측면에서도 중요한 과제라고 생각합니다. 저는 학부에서 전력시스템 과목을 수강하며 ㅇㅇ 프로젝트로 분산전원 연계 시 발생하는 계통 영향을 분석한 경험이 있는데, 이때 현장의 어려움을 간접적으로 체감했습니다. 입사 후에는 계통 연계 검토 업무에 제 분석 경험을 보태, 분산에너지 확산 속도에 맞춰 안정적인 전력망을 운영하는 데 기여하겠습니다.</w:t>
+      </w:r>
+    </w:p>
+    <w:p>
+      <w:pPr>
+        <w:spacing w:line="240" w:lineRule="auto" w:before="0" w:after="0"/>
+      </w:pPr>
+    </w:p>
+    <w:p>
+      <w:pPr>
+        <w:spacing w:line="240" w:lineRule="auto" w:before="0" w:after="0"/>
+      </w:pPr>
+    </w:p>
+    <w:p>
+      <w:pPr>
+        <w:spacing w:line="360" w:lineRule="auto" w:before="0" w:after="80"/>
+        <w:ind w:left="454"/>
+        <w:pBdr>
+          <w:left w:val="single" w:sz="18" w:space="10" w:color="888888"/>
+        </w:pBdr>
+        <w:shd w:val="clear" w:color="auto" w:fill="F2F2F2"/>
+      </w:pPr>
+      <w:r>
+        <w:rPr>
+          <w:rFonts w:ascii="Arial" w:hAnsi="Arial" w:eastAsia="맑은 고딕" w:cs="Arial"/>
+          <w:b w:val="0"/>
+          <w:sz w:val="22"/>
+        </w:rPr>
+        <w:t>예시 2) 국민건강보험공단 행정직 - 건강생활실천지원금제</w:t>
       </w:r>
     </w:p>
     <w:p>
@@ -963,7 +633,7 @@
           <w:b w:val="0"/>
           <w:sz w:val="22"/>
         </w:rPr>
-        <w:t>현장 배치 후에는 설비 점검 데이터의 정확성을 높이는 데 기여하고 싶습니다. 정전 시간을 1분이라도 단축하는 일이 결국 국민 안전과 직결된다는 점을 잊지 않고 업무를 수행하겠습니다.</w:t>
+        <w:t>제가 가장 관심을 두고 있는 사업은 건강생활실천지원금제입니다. 이 사업을 선택한 이유는 세 가지입니다. 첫째, 공단의 중장기 계획에서 예방 중심 건강관리 체계 전환이 핵심 방향으로 명시되어 있고, 이 사업이 그 방향의 대표 사업이기 때문입니다. 둘째, 만성질환 진료비 증가로 건강보험 재정 부담이 커지는 상황에서, 사후 진료보다 사전 예방으로 무게중심을 옮기는 것이 가입자 ㅇㅇ천만 명을 위한 가장 본질적인 해법이라고 생각하기 때문입니다. 셋째, 저는 대학 시절 ㅇㅇ 보건소 서포터즈 활동을 하며 만성질환 자가관리 프로그램에 참여한 적이 있는데, 행동 변화를 유도하는 인센티브 설계가 얼마나 어렵고 또 중요한지 직접 경험했습니다. 입사 후에는 가입자 데이터 기반으로 참여 동기를 끌어올리는 운영 개선에 기여하고 싶습니다.</w:t>
       </w:r>
     </w:p>
     <w:p>
@@ -973,7 +643,17 @@
     </w:p>
     <w:p>
       <w:pPr>
-        <w:spacing w:line="360" w:lineRule="auto" w:before="0" w:after="120"/>
+        <w:spacing w:line="240" w:lineRule="auto" w:before="0" w:after="0"/>
+      </w:pPr>
+    </w:p>
+    <w:p>
+      <w:pPr>
+        <w:spacing w:line="360" w:lineRule="auto" w:before="0" w:after="80"/>
+        <w:ind w:left="454"/>
+        <w:pBdr>
+          <w:left w:val="single" w:sz="18" w:space="10" w:color="888888"/>
+        </w:pBdr>
+        <w:shd w:val="clear" w:color="auto" w:fill="F2F2F2"/>
       </w:pPr>
       <w:r>
         <w:rPr>
@@ -981,30 +661,7 @@
           <w:b w:val="0"/>
           <w:sz w:val="22"/>
         </w:rPr>
-        <w:t>#### 예시 3) 국민건강보험공단 - 행정직 - 기관 방향성 출발형</w:t>
-      </w:r>
-    </w:p>
-    <w:p>
-      <w:pPr>
-        <w:spacing w:line="240" w:lineRule="auto" w:before="0" w:after="0"/>
-      </w:pPr>
-    </w:p>
-    <w:p>
-      <w:pPr>
-        <w:spacing w:line="360" w:lineRule="auto" w:before="0" w:after="80"/>
-        <w:ind w:left="454"/>
-        <w:pBdr>
-          <w:left w:val="single" w:sz="18" w:space="10" w:color="888888"/>
-        </w:pBdr>
-        <w:shd w:val="clear" w:color="auto" w:fill="F2F2F2"/>
-      </w:pPr>
-      <w:r>
-        <w:rPr>
-          <w:rFonts w:ascii="Arial" w:hAnsi="Arial" w:eastAsia="맑은 고딕" w:cs="Arial"/>
-          <w:b w:val="0"/>
-          <w:sz w:val="22"/>
-        </w:rPr>
-        <w:t>국민건강보험공단이 현재 가장 역량을 집중하고 있는 일차의료 만성질환관리 시범사업에 큰 관심을 갖고 있습니다.</w:t>
+        <w:t>예시 3) 한국토지주택공사 행정직 - 청년 매입임대주택 사업</w:t>
       </w:r>
     </w:p>
     <w:p>
@@ -1039,7 +696,35 @@
           <w:b w:val="0"/>
           <w:sz w:val="22"/>
         </w:rPr>
-        <w:t>이사장님 신년사와 올해 경영공시에서 공통적으로 강조된 방향성이 "치료 중심에서 예방 중심으로의 전환" 이었고, 그 핵심에 만성질환관리 사업이 있다고 이해했습니다. 고령화 속도가 빨라지면서 만성질환 의료비가 전체 의료비의 ㅇㅇ% 이상을 차지하는 현실에서, 이 사업은 가입자 건강과 보험재정 건전성 두 가지를 동시에 지키는 사업이라고 판단했습니다. 저 역시 가족 중 당뇨 진단 후 관리 체계 부재로 합병증을 겪은 사례가 있어, 예방·관리 체계의 중요성을 가까이서 느껴왔습니다.</w:t>
+        <w:t>청년 매입임대주택 사업이 LH의 사업 중 가장 관심 있는 분야입니다. LH 신년사에서 주거취약계층 지원 강화가 가장 먼저 언급되었고, 경영 공시 자료에서도 청년·신혼부부 주거 지원 물량이 매년 확대되고 있다는 점에서 기관이 힘을 싣는 사업임을 확인했습니다. 또한 청년층의 주거비 부담은 단순히 개인의 문제가 아니라 결혼·출산·일자리까지 연결되는 사회 구조적 문제라고 보기 때문에, 이 사업의 사회적 의미가 크다고 생각합니다. 저 역시 대학 시절 학교 근처에서 ㅇㅇ년간 자취를 하며 매년 임대료 인상에 부딪혀 본 경험이 있고, 그 과정에서 공공임대의 가치를 절감했습니다. 입사 후에는 매입 대상 주택 선정과 입주자 모집 절차에서 수혜자가 체감할 수 있는 행정 서비스 개선에 보태겠습니다.</w:t>
+      </w:r>
+    </w:p>
+    <w:p>
+      <w:pPr>
+        <w:spacing w:line="240" w:lineRule="auto" w:before="0" w:after="0"/>
+      </w:pPr>
+    </w:p>
+    <w:p>
+      <w:pPr>
+        <w:spacing w:line="240" w:lineRule="auto" w:before="0" w:after="0"/>
+      </w:pPr>
+    </w:p>
+    <w:p>
+      <w:pPr>
+        <w:spacing w:line="360" w:lineRule="auto" w:before="0" w:after="80"/>
+        <w:ind w:left="454"/>
+        <w:pBdr>
+          <w:left w:val="single" w:sz="18" w:space="10" w:color="888888"/>
+        </w:pBdr>
+        <w:shd w:val="clear" w:color="auto" w:fill="F2F2F2"/>
+      </w:pPr>
+      <w:r>
+        <w:rPr>
+          <w:rFonts w:ascii="Arial" w:hAnsi="Arial" w:eastAsia="맑은 고딕" w:cs="Arial"/>
+          <w:b w:val="0"/>
+          <w:sz w:val="22"/>
+        </w:rPr>
+        <w:t>예시 4) 한국수자원공사 기술직 - 스마트 물관리 사업</w:t>
       </w:r>
     </w:p>
     <w:p>
@@ -1074,7 +759,7 @@
           <w:b w:val="0"/>
           <w:sz w:val="22"/>
         </w:rPr>
-        <w:t>입사 후에는 가입자 데이터 관리 업무에서 정확성을 보태고 싶습니다. 작은 데이터 오류 하나가 한 사람의 건강 관리 경로를 바꿀 수 있다는 책임감을 가지고 업무를 수행하겠습니다.</w:t>
+        <w:t>저는 K-water의 스마트 물관리 사업에 가장 큰 관심이 있습니다. 그 이유는 본인 경험과의 연결고리에서부터 출발합니다. 저는 학부 졸업 프로젝트로 ㅇㅇ 지역 상수도 누수율 개선을 주제로 데이터 분석을 진행한 적이 있고, 이때 ICT 기반 실시간 모니터링이 누수 저감에 결정적이라는 점을 확인했습니다. 이 경험을 한 이후 K-water의 사업을 살펴보니, 공사가 발표한 중장기 경영목표에서 디지털 물관리 전환이 최우선 과제로 제시되어 있었고, 기후 위기로 인한 물 부족과 수질 사고가 사회적 이슈로 떠오르는 지금 이 사업의 중요성은 더욱 커졌다고 생각합니다. 입사 후에는 스마트 미터링과 누수 탐지 시스템 운영 단계에서 데이터 분석 역량을 보태, 국민이 안심하고 마실 수 있는 물 공급에 기여하겠습니다.</w:t>
       </w:r>
     </w:p>
     <w:p>
@@ -1084,7 +769,17 @@
     </w:p>
     <w:p>
       <w:pPr>
-        <w:spacing w:line="360" w:lineRule="auto" w:before="0" w:after="120"/>
+        <w:spacing w:line="240" w:lineRule="auto" w:before="0" w:after="0"/>
+      </w:pPr>
+    </w:p>
+    <w:p>
+      <w:pPr>
+        <w:spacing w:line="360" w:lineRule="auto" w:before="0" w:after="80"/>
+        <w:ind w:left="454"/>
+        <w:pBdr>
+          <w:left w:val="single" w:sz="18" w:space="10" w:color="888888"/>
+        </w:pBdr>
+        <w:shd w:val="clear" w:color="auto" w:fill="F2F2F2"/>
       </w:pPr>
       <w:r>
         <w:rPr>
@@ -1092,30 +787,7 @@
           <w:b w:val="0"/>
           <w:sz w:val="22"/>
         </w:rPr>
-        <w:t>#### 예시 4) 한국수자원공사 - 기술직 - 경험+사회이슈 결합형</w:t>
-      </w:r>
-    </w:p>
-    <w:p>
-      <w:pPr>
-        <w:spacing w:line="240" w:lineRule="auto" w:before="0" w:after="0"/>
-      </w:pPr>
-    </w:p>
-    <w:p>
-      <w:pPr>
-        <w:spacing w:line="360" w:lineRule="auto" w:before="0" w:after="80"/>
-        <w:ind w:left="454"/>
-        <w:pBdr>
-          <w:left w:val="single" w:sz="18" w:space="10" w:color="888888"/>
-        </w:pBdr>
-        <w:shd w:val="clear" w:color="auto" w:fill="F2F2F2"/>
-      </w:pPr>
-      <w:r>
-        <w:rPr>
-          <w:rFonts w:ascii="Arial" w:hAnsi="Arial" w:eastAsia="맑은 고딕" w:cs="Arial"/>
-          <w:b w:val="0"/>
-          <w:sz w:val="22"/>
-        </w:rPr>
-        <w:t>K-water의 스마트 물관리 플랫폼 구축 사업에 가장 관심이 있습니다.</w:t>
+        <w:t>예시 5) 한국철도공사 행정직 - 교통약자 이동권 보장 사업</w:t>
       </w:r>
     </w:p>
     <w:p>
@@ -1150,7 +822,85 @@
           <w:b w:val="0"/>
           <w:sz w:val="22"/>
         </w:rPr>
-        <w:t>토목공학 전공 캡스톤 과제로 ㅇㅇ 지역 하천 유량 데이터를 분석한 적이 있는데, 그 과정에서 기후변화로 인해 가뭄과 홍수가 같은 해에 반복되는 패턴을 직접 확인했습니다. 단순히 댐을 더 짓는 방식으로는 해결되지 않고, 실시간 데이터 기반의 통합 물관리가 필요하다는 결론에 도달했습니다. K-water가 중장기 계획에서 디지털 트윈 기반 물관리 체계를 핵심 과제로 제시하고 있는 것도 같은 문제의식이라고 보았습니다.</w:t>
+        <w:t>코레일이 추진하는 사업 중 교통약자 이동 편의 증진 사업에 가장 관심이 갑니다. 기관장 취임사에서 안전과 함께 강조된 키워드가 모든 국민이 차별 없이 이용하는 철도였고, 중장기 계획에서도 무장애 역사 확대와 교통약자 응대 서비스 고도화가 명시되어 있다는 점에서 기관의 우선 사업으로 판단했습니다. 동시에 고령화 사회로 진입한 우리나라에서 이동권은 단순한 편의가 아니라 국민의 기본권에 가까운 영역이고, 철도가 가진 공공성을 가장 잘 드러내는 사업이라고 봅니다. 저는 ㅇㅇ 봉사단체에서 ㅇㅇ개월간 어르신 이동 동행 서비스에 참여한 경험이 있는데, 그때 한 분이 "기차 타려면 가족 도움이 꼭 필요하다"고 하신 말씀이 오래 남았습니다. 입사 후에는 역무 운영과 안내 서비스 단계에서 교통약자 응대 매뉴얼 개선에 기여하고 싶습니다.</w:t>
+      </w:r>
+    </w:p>
+    <w:p>
+      <w:pPr>
+        <w:spacing w:line="240" w:lineRule="auto" w:before="0" w:after="0"/>
+      </w:pPr>
+    </w:p>
+    <w:p>
+      <w:pPr>
+        <w:spacing w:line="240" w:lineRule="auto" w:before="0" w:after="0"/>
+      </w:pPr>
+    </w:p>
+    <w:p>
+      <w:pPr>
+        <w:spacing w:line="240" w:lineRule="auto" w:before="0" w:after="0"/>
+        <w:jc w:val="center"/>
+        <w:pBdr>
+          <w:bottom w:val="single" w:sz="8" w:space="1" w:color="888888"/>
+        </w:pBdr>
+      </w:pPr>
+    </w:p>
+    <w:p>
+      <w:pPr>
+        <w:spacing w:line="240" w:lineRule="auto" w:before="0" w:after="0"/>
+      </w:pPr>
+    </w:p>
+    <w:p>
+      <w:pPr>
+        <w:spacing w:line="360" w:lineRule="auto" w:before="280" w:after="160"/>
+      </w:pPr>
+      <w:r>
+        <w:rPr>
+          <w:rFonts w:ascii="Arial" w:hAnsi="Arial" w:eastAsia="맑은 고딕" w:cs="Arial"/>
+          <w:b/>
+          <w:sz w:val="24"/>
+        </w:rPr>
+        <w:t>⚠️ 답변 작성 시 자주 나오는 실수</w:t>
+      </w:r>
+    </w:p>
+    <w:p>
+      <w:pPr>
+        <w:spacing w:line="240" w:lineRule="auto" w:before="0" w:after="0"/>
+      </w:pPr>
+    </w:p>
+    <w:p>
+      <w:pPr>
+        <w:spacing w:line="360" w:lineRule="auto" w:before="0" w:after="80"/>
+        <w:ind w:left="454"/>
+        <w:pBdr>
+          <w:left w:val="single" w:sz="18" w:space="10" w:color="888888"/>
+        </w:pBdr>
+        <w:shd w:val="clear" w:color="auto" w:fill="F2F2F2"/>
+      </w:pPr>
+      <w:r>
+        <w:rPr>
+          <w:rFonts w:ascii="Arial" w:hAnsi="Arial" w:eastAsia="맑은 고딕" w:cs="Arial"/>
+          <w:b w:val="0"/>
+          <w:sz w:val="22"/>
+        </w:rPr>
+        <w:t>❌ "최근에 ㅇㅇ 사업이 뉴스에 많이 나와서 관심이 갔습니다."</w:t>
+      </w:r>
+    </w:p>
+    <w:p>
+      <w:pPr>
+        <w:spacing w:line="360" w:lineRule="auto" w:before="0" w:after="80"/>
+        <w:ind w:left="454"/>
+        <w:pBdr>
+          <w:left w:val="single" w:sz="18" w:space="10" w:color="888888"/>
+        </w:pBdr>
+        <w:shd w:val="clear" w:color="auto" w:fill="F2F2F2"/>
+      </w:pPr>
+      <w:r>
+        <w:rPr>
+          <w:rFonts w:ascii="Arial" w:hAnsi="Arial" w:eastAsia="맑은 고딕" w:cs="Arial"/>
+          <w:b w:val="0"/>
+          <w:sz w:val="22"/>
+        </w:rPr>
+        <w:t>→ 뉴스 빈도가 근거가 되면 안 됩니다. 기관의 우선순위, 사회적 의미, 본인 연결고리 중 최소 2가지로 근거를 잡으시기 바랍니다.</w:t>
       </w:r>
     </w:p>
     <w:p>
@@ -1185,17 +935,17 @@
           <w:b w:val="0"/>
           <w:sz w:val="22"/>
         </w:rPr>
-        <w:t>입사 후에는 데이터 수집·분석 단계에서 현장 측정값의 신뢰도를 높이는 데 기여하고 싶습니다. 플랫폼이 아무리 정교해도 입력 데이터가 부정확하면 의사결정이 흔들린다는 점을 알고 있기에, 기초 데이터의 품질을 지키는 일을 묵묵히 수행하겠습니다.</w:t>
+        <w:t>❌ "사업 ㅇㅇ도 있고, 사업 ㅇㅇ도 있고, 사업 ㅇㅇ도 관심 있습니다."</w:t>
       </w:r>
     </w:p>
     <w:p>
       <w:pPr>
-        <w:spacing w:line="240" w:lineRule="auto" w:before="0" w:after="0"/>
-      </w:pPr>
-    </w:p>
-    <w:p>
-      <w:pPr>
-        <w:spacing w:line="360" w:lineRule="auto" w:before="0" w:after="120"/>
+        <w:spacing w:line="360" w:lineRule="auto" w:before="0" w:after="80"/>
+        <w:ind w:left="454"/>
+        <w:pBdr>
+          <w:left w:val="single" w:sz="18" w:space="10" w:color="888888"/>
+        </w:pBdr>
+        <w:shd w:val="clear" w:color="auto" w:fill="F2F2F2"/>
       </w:pPr>
       <w:r>
         <w:rPr>
@@ -1203,30 +953,7 @@
           <w:b w:val="0"/>
           <w:sz w:val="22"/>
         </w:rPr>
-        <w:t>#### 예시 5) 한국철도공사 - 행정직 - 1차 고객 관점 출발형</w:t>
-      </w:r>
-    </w:p>
-    <w:p>
-      <w:pPr>
-        <w:spacing w:line="240" w:lineRule="auto" w:before="0" w:after="0"/>
-      </w:pPr>
-    </w:p>
-    <w:p>
-      <w:pPr>
-        <w:spacing w:line="360" w:lineRule="auto" w:before="0" w:after="80"/>
-        <w:ind w:left="454"/>
-        <w:pBdr>
-          <w:left w:val="single" w:sz="18" w:space="10" w:color="888888"/>
-        </w:pBdr>
-        <w:shd w:val="clear" w:color="auto" w:fill="F2F2F2"/>
-      </w:pPr>
-      <w:r>
-        <w:rPr>
-          <w:rFonts w:ascii="Arial" w:hAnsi="Arial" w:eastAsia="맑은 고딕" w:cs="Arial"/>
-          <w:b w:val="0"/>
-          <w:sz w:val="22"/>
-        </w:rPr>
-        <w:t>코레일의 교통약자 이동권 보장 사업에 관심이 가장 큽니다.</w:t>
+        <w:t>→ 사업을 나열하지 마시기 바랍니다. 하나를 고르고, 그 하나에 대한 근거를 깊게 보여주는 것이 정답입니다.</w:t>
       </w:r>
     </w:p>
     <w:p>
@@ -1261,7 +988,7 @@
           <w:b w:val="0"/>
           <w:sz w:val="22"/>
         </w:rPr>
-        <w:t>역사 자원봉사 활동을 ㅇㅇ개월간 하면서, 휠체어 이용자와 시각장애인 어르신들이 환승 한 번을 위해 이동 동선을 ㅇㅇ분 이상 우회하는 모습을 자주 보았습니다. 이동권은 단순한 편의가 아니라 일상의 자립과 직결된 문제임을 그때 체감했습니다. 코레일이 중장기 경영목표에서 "모두를 위한 철도" 를 강조하며 무장애 역사 확대와 안내 서비스 고도화를 추진 과제로 두고 있는 것이 이 문제의식과 정확히 맞닿아 있다고 보았습니다.</w:t>
+        <w:t>❌ "이 사업을 통해 많이 배우고 성장하고 싶습니다."</w:t>
       </w:r>
     </w:p>
     <w:p>
@@ -1279,16 +1006,50 @@
           <w:b w:val="0"/>
           <w:sz w:val="22"/>
         </w:rPr>
+        <w:t>→ 마무리가 학습/성장 톤으로 끝나면 안 됩니다. "ㅇㅇ에 보태겠다", "ㅇㅇ 업무에 기여하겠다"처럼 실행/기여 톤으로 마무리하시기 바랍니다.</w:t>
       </w:r>
     </w:p>
     <w:p>
       <w:pPr>
+        <w:spacing w:line="240" w:lineRule="auto" w:before="0" w:after="0"/>
+      </w:pPr>
+    </w:p>
+    <w:p>
+      <w:pPr>
+        <w:spacing w:line="240" w:lineRule="auto" w:before="0" w:after="0"/>
+      </w:pPr>
+    </w:p>
+    <w:p>
+      <w:pPr>
+        <w:spacing w:line="240" w:lineRule="auto" w:before="0" w:after="0"/>
+        <w:jc w:val="center"/>
+        <w:pBdr>
+          <w:bottom w:val="single" w:sz="8" w:space="1" w:color="888888"/>
+        </w:pBdr>
+      </w:pPr>
+    </w:p>
+    <w:p>
+      <w:pPr>
+        <w:spacing w:line="240" w:lineRule="auto" w:before="0" w:after="0"/>
+      </w:pPr>
+    </w:p>
+    <w:p>
+      <w:pPr>
+        <w:spacing w:line="360" w:lineRule="auto" w:before="280" w:after="160"/>
+      </w:pPr>
+      <w:r>
+        <w:rPr>
+          <w:rFonts w:ascii="Arial" w:hAnsi="Arial" w:eastAsia="맑은 고딕" w:cs="Arial"/>
+          <w:b/>
+          <w:sz w:val="24"/>
+        </w:rPr>
+        <w:t>✅ 마지막 점검 체크리스트</w:t>
+      </w:r>
+    </w:p>
+    <w:p>
+      <w:pPr>
         <w:spacing w:line="360" w:lineRule="auto" w:before="0" w:after="80"/>
-        <w:ind w:left="454"/>
-        <w:pBdr>
-          <w:left w:val="single" w:sz="18" w:space="10" w:color="888888"/>
-        </w:pBdr>
-        <w:shd w:val="clear" w:color="auto" w:fill="F2F2F2"/>
+        <w:ind w:left="340"/>
       </w:pPr>
       <w:r>
         <w:rPr>
@@ -1296,17 +1057,13 @@
           <w:b w:val="0"/>
           <w:sz w:val="22"/>
         </w:rPr>
-        <w:t>행정 업무를 수행하면서 교통약자 관련 민원 데이터와 현장 의견을 정리·반영하는 절차에 기여하고 싶습니다. 한 분의 이동이 더 편해지는 일이 곧 공공성을 실현하는 일이라는 마음으로 업무를 수행하겠습니다.</w:t>
+        <w:t>• 첫 문장에 관심 사업명이 명확하게 등장했는가</w:t>
       </w:r>
     </w:p>
     <w:p>
       <w:pPr>
-        <w:spacing w:line="240" w:lineRule="auto" w:before="0" w:after="0"/>
-      </w:pPr>
-    </w:p>
-    <w:p>
-      <w:pPr>
-        <w:spacing w:line="360" w:lineRule="auto" w:before="0" w:after="120"/>
+        <w:spacing w:line="360" w:lineRule="auto" w:before="0" w:after="80"/>
+        <w:ind w:left="340"/>
       </w:pPr>
       <w:r>
         <w:rPr>
@@ -1314,22 +1071,13 @@
           <w:b w:val="0"/>
           <w:sz w:val="22"/>
         </w:rPr>
-        <w:t>#### 예시 6) 한국가스공사 - 기술직 - 기관 전환 흐름 출발형</w:t>
+        <w:t>• 기관의 중장기 계획, 신년사, 경영 공시 중 최소 1가지 출처에 근거를 두었는가</w:t>
       </w:r>
     </w:p>
     <w:p>
       <w:pPr>
-        <w:spacing w:line="240" w:lineRule="auto" w:before="0" w:after="0"/>
-      </w:pPr>
-    </w:p>
-    <w:p>
-      <w:pPr>
         <w:spacing w:line="360" w:lineRule="auto" w:before="0" w:after="80"/>
-        <w:ind w:left="454"/>
-        <w:pBdr>
-          <w:left w:val="single" w:sz="18" w:space="10" w:color="888888"/>
-        </w:pBdr>
-        <w:shd w:val="clear" w:color="auto" w:fill="F2F2F2"/>
+        <w:ind w:left="340"/>
       </w:pPr>
       <w:r>
         <w:rPr>
@@ -1337,17 +1085,13 @@
           <w:b w:val="0"/>
           <w:sz w:val="22"/>
         </w:rPr>
-        <w:t>한국가스공사의 수소 인프라 구축 사업에 가장 관심이 있습니다.</w:t>
+        <w:t>• 사회 문제 또는 사회적 의미를 본인 언어로 해석했는가</w:t>
       </w:r>
     </w:p>
     <w:p>
       <w:pPr>
         <w:spacing w:line="360" w:lineRule="auto" w:before="0" w:after="80"/>
-        <w:ind w:left="454"/>
-        <w:pBdr>
-          <w:left w:val="single" w:sz="18" w:space="10" w:color="888888"/>
-        </w:pBdr>
-        <w:shd w:val="clear" w:color="auto" w:fill="F2F2F2"/>
+        <w:ind w:left="340"/>
       </w:pPr>
       <w:r>
         <w:rPr>
@@ -1355,16 +1099,13 @@
           <w:b w:val="0"/>
           <w:sz w:val="22"/>
         </w:rPr>
+        <w:t>• 본인 경험과 사업 사이의 연결고리가 자연스럽게 만들어졌는가</w:t>
       </w:r>
     </w:p>
     <w:p>
       <w:pPr>
         <w:spacing w:line="360" w:lineRule="auto" w:before="0" w:after="80"/>
-        <w:ind w:left="454"/>
-        <w:pBdr>
-          <w:left w:val="single" w:sz="18" w:space="10" w:color="888888"/>
-        </w:pBdr>
-        <w:shd w:val="clear" w:color="auto" w:fill="F2F2F2"/>
+        <w:ind w:left="340"/>
       </w:pPr>
       <w:r>
         <w:rPr>
@@ -1372,17 +1113,13 @@
           <w:b w:val="0"/>
           <w:sz w:val="22"/>
         </w:rPr>
-        <w:t>사장님 취임사에서 "천연가스에서 수소까지" 라는 에너지 전환 방향성이 강조되었고, 중장기 계획에서도 수소 생산·공급망 확보가 핵심 과제로 명시되어 있습니다. 화학공학을 전공하며 수소 생산 공정 관련 학회 발표를 ㅇㅇ회 준비한 경험이 있어, 이 흐름의 기술적 난이도와 사회적 필요성을 함께 이해하고 있습니다. 특히 탄소중립이라는 국가 과제 속에서, 가스공사의 인프라 운영 노하우는 수소 시대로 가는 가장 현실적인 다리 역할을 한다고 판단했습니다.</w:t>
+        <w:t>• 마무리가 "기여하겠다", "보태겠다", "수행하겠다" 톤으로 끝났는가</w:t>
       </w:r>
     </w:p>
     <w:p>
       <w:pPr>
         <w:spacing w:line="360" w:lineRule="auto" w:before="0" w:after="80"/>
-        <w:ind w:left="454"/>
-        <w:pBdr>
-          <w:left w:val="single" w:sz="18" w:space="10" w:color="888888"/>
-        </w:pBdr>
-        <w:shd w:val="clear" w:color="auto" w:fill="F2F2F2"/>
+        <w:ind w:left="340"/>
       </w:pPr>
       <w:r>
         <w:rPr>
@@ -1390,16 +1127,44 @@
           <w:b w:val="0"/>
           <w:sz w:val="22"/>
         </w:rPr>
+        <w:t>• 사기업 용어(매출, 경쟁력, 영업, 시장 점유율 등)가 섞이지 않았는가</w:t>
       </w:r>
     </w:p>
     <w:p>
       <w:pPr>
-        <w:spacing w:line="360" w:lineRule="auto" w:before="0" w:after="80"/>
-        <w:ind w:left="454"/>
+        <w:spacing w:line="240" w:lineRule="auto" w:before="0" w:after="0"/>
+      </w:pPr>
+    </w:p>
+    <w:p>
+      <w:pPr>
+        <w:spacing w:line="240" w:lineRule="auto" w:before="0" w:after="0"/>
+        <w:jc w:val="center"/>
         <w:pBdr>
-          <w:left w:val="single" w:sz="18" w:space="10" w:color="888888"/>
+          <w:bottom w:val="single" w:sz="8" w:space="1" w:color="888888"/>
         </w:pBdr>
-        <w:shd w:val="clear" w:color="auto" w:fill="F2F2F2"/>
+      </w:pPr>
+    </w:p>
+    <w:p>
+      <w:pPr>
+        <w:spacing w:line="240" w:lineRule="auto" w:before="0" w:after="0"/>
+      </w:pPr>
+    </w:p>
+    <w:p>
+      <w:pPr>
+        <w:spacing w:line="360" w:lineRule="auto" w:before="280" w:after="160"/>
+      </w:pPr>
+      <w:r>
+        <w:rPr>
+          <w:rFonts w:ascii="Arial" w:hAnsi="Arial" w:eastAsia="맑은 고딕" w:cs="Arial"/>
+          <w:b/>
+          <w:sz w:val="24"/>
+        </w:rPr>
+        <w:t>📝 마무리</w:t>
+      </w:r>
+    </w:p>
+    <w:p>
+      <w:pPr>
+        <w:spacing w:line="360" w:lineRule="auto" w:before="0" w:after="120"/>
       </w:pPr>
       <w:r>
         <w:rPr>
@@ -1407,44 +1172,7 @@
           <w:b w:val="0"/>
           <w:sz w:val="22"/>
         </w:rPr>
-        <w:t>입사 후에는 인프라 안전 점검 업무에서 기여하고 싶습니다. 수소는 안전이 곧 신뢰이기 때문에, 점검 절차의 원칙을 지키는 일이 곧 사업 전체의 토대가 된다는 마음으로 업무를 수행하겠습니다.</w:t>
-      </w:r>
-    </w:p>
-    <w:p>
-      <w:pPr>
-        <w:spacing w:line="240" w:lineRule="auto" w:before="0" w:after="0"/>
-      </w:pPr>
-    </w:p>
-    <w:p>
-      <w:pPr>
-        <w:spacing w:line="240" w:lineRule="auto" w:before="0" w:after="0"/>
-      </w:pPr>
-    </w:p>
-    <w:p>
-      <w:pPr>
-        <w:spacing w:line="240" w:lineRule="auto" w:before="0" w:after="0"/>
-        <w:jc w:val="center"/>
-        <w:pBdr>
-          <w:bottom w:val="single" w:sz="8" w:space="1" w:color="888888"/>
-        </w:pBdr>
-      </w:pPr>
-    </w:p>
-    <w:p>
-      <w:pPr>
-        <w:spacing w:line="240" w:lineRule="auto" w:before="0" w:after="0"/>
-      </w:pPr>
-    </w:p>
-    <w:p>
-      <w:pPr>
-        <w:spacing w:line="360" w:lineRule="auto" w:before="280" w:after="160"/>
-      </w:pPr>
-      <w:r>
-        <w:rPr>
-          <w:rFonts w:ascii="Arial" w:hAnsi="Arial" w:eastAsia="맑은 고딕" w:cs="Arial"/>
-          <w:b/>
-          <w:sz w:val="24"/>
-        </w:rPr>
-        <w:t>⚠️ 자주 하시는 실수 5가지</w:t>
+        <w:t>관심 사업 질문은 결국 두 가지를 봅니다. 첫째, 우리 기관을 표면이 아니라 깊이 들여다봤는가. 둘째, 그 사업에 본인을 진짜로 연결할 수 있는가. 이 두 가지가 답변에 담겨 있으면, 사업명이 무엇이든 합격권의 답변이 됩니다.</w:t>
       </w:r>
     </w:p>
     <w:p>
@@ -1457,237 +1185,7 @@
           <w:b w:val="0"/>
           <w:sz w:val="22"/>
         </w:rPr>
-        <w:t>답변 예시를 보셨으니, 이제 흔히 하시는 실수도 함께 정리해드리겠습니다.</w:t>
-      </w:r>
-    </w:p>
-    <w:p>
-      <w:pPr>
-        <w:spacing w:line="360" w:lineRule="auto" w:before="0" w:after="120"/>
-      </w:pPr>
-      <w:r>
-        <w:rPr>
-          <w:rFonts w:ascii="Arial" w:hAnsi="Arial" w:eastAsia="맑은 고딕" w:cs="Arial"/>
-          <w:b w:val="0"/>
-          <w:sz w:val="22"/>
-        </w:rPr>
-        <w:t>#### ❌ 실수 1) 사업명만 던지고 끝나는 답변</w:t>
-      </w:r>
-    </w:p>
-    <w:p>
-      <w:pPr>
-        <w:spacing w:line="360" w:lineRule="auto" w:before="0" w:after="120"/>
-      </w:pPr>
-      <w:r>
-        <w:rPr>
-          <w:rFonts w:ascii="Arial" w:hAnsi="Arial" w:eastAsia="맑은 고딕" w:cs="Arial"/>
-          <w:b w:val="0"/>
-          <w:sz w:val="22"/>
-        </w:rPr>
-        <w:t>"저는 ㅇㅇ사업에 관심 있습니다. 미래 핵심 사업이기 때문입니다." 끝. 이런 답변은 누구나 할 수 있고, 면접관 기억에 남지 않습니다. 반드시 본인 경험 또는 사회 이슈와 묶으시기 바랍니다.</w:t>
-      </w:r>
-    </w:p>
-    <w:p>
-      <w:pPr>
-        <w:spacing w:line="360" w:lineRule="auto" w:before="0" w:after="120"/>
-      </w:pPr>
-      <w:r>
-        <w:rPr>
-          <w:rFonts w:ascii="Arial" w:hAnsi="Arial" w:eastAsia="맑은 고딕" w:cs="Arial"/>
-          <w:b w:val="0"/>
-          <w:sz w:val="22"/>
-        </w:rPr>
-        <w:t>#### ❌ 실수 2) 사기업 용어로 사업을 설명하는 경우</w:t>
-      </w:r>
-    </w:p>
-    <w:p>
-      <w:pPr>
-        <w:spacing w:line="360" w:lineRule="auto" w:before="0" w:after="120"/>
-      </w:pPr>
-      <w:r>
-        <w:rPr>
-          <w:rFonts w:ascii="Arial" w:hAnsi="Arial" w:eastAsia="맑은 고딕" w:cs="Arial"/>
-          <w:b w:val="0"/>
-          <w:sz w:val="22"/>
-        </w:rPr>
-        <w:t>"매출 비중이 높은 사업", "경쟁력이 강한 사업", "공격적으로 추진하는 사업" 같은 표현은 절대 금물입니다. 공기업은 매출이 아니라 사업 성과, 경쟁력이 아니라 전문성, 공격적이 아니라 적극적·선제적 으로 표현하셔야 합니다.</w:t>
-      </w:r>
-    </w:p>
-    <w:p>
-      <w:pPr>
-        <w:spacing w:line="360" w:lineRule="auto" w:before="0" w:after="120"/>
-      </w:pPr>
-      <w:r>
-        <w:rPr>
-          <w:rFonts w:ascii="Arial" w:hAnsi="Arial" w:eastAsia="맑은 고딕" w:cs="Arial"/>
-          <w:b w:val="0"/>
-          <w:sz w:val="22"/>
-        </w:rPr>
-        <w:t>#### ❌ 실수 3) 마무리가 "배우겠다", "성장하겠다" 인 경우</w:t>
-      </w:r>
-    </w:p>
-    <w:p>
-      <w:pPr>
-        <w:spacing w:line="360" w:lineRule="auto" w:before="0" w:after="120"/>
-      </w:pPr>
-      <w:r>
-        <w:rPr>
-          <w:rFonts w:ascii="Arial" w:hAnsi="Arial" w:eastAsia="맑은 고딕" w:cs="Arial"/>
-          <w:b w:val="0"/>
-          <w:sz w:val="22"/>
-        </w:rPr>
-        <w:t>이 질문은 결국 "당신이 어떻게 기여할 것인가" 를 묻는 질문입니다. 본인이 받아갈 것(배움/성장)이 아니라, 본인이 보탤 것(기여/실행)으로 마무리하셔야 합니다.</w:t>
-      </w:r>
-    </w:p>
-    <w:p>
-      <w:pPr>
-        <w:spacing w:line="360" w:lineRule="auto" w:before="0" w:after="120"/>
-      </w:pPr>
-      <w:r>
-        <w:rPr>
-          <w:rFonts w:ascii="Arial" w:hAnsi="Arial" w:eastAsia="맑은 고딕" w:cs="Arial"/>
-          <w:b w:val="0"/>
-          <w:sz w:val="22"/>
-        </w:rPr>
-        <w:t>#### ❌ 실수 4) 기관 핵심 사업이 아닌 곁가지 사업을 고르는 경우</w:t>
-      </w:r>
-    </w:p>
-    <w:p>
-      <w:pPr>
-        <w:spacing w:line="360" w:lineRule="auto" w:before="0" w:after="120"/>
-      </w:pPr>
-      <w:r>
-        <w:rPr>
-          <w:rFonts w:ascii="Arial" w:hAnsi="Arial" w:eastAsia="맑은 고딕" w:cs="Arial"/>
-          <w:b w:val="0"/>
-          <w:sz w:val="22"/>
-        </w:rPr>
-        <w:t>홈페이지 한 구석에 있던 사업을 고르시면, 면접관이 "왜 그 사업이지?" 하고 갸우뚱합니다. 알리오 중장기 경영목표, 기관장 신년사, 보도자료 빈도 - 이 세 곳에서 공통으로 잡히는 사업을 고르시기 바랍니다.</w:t>
-      </w:r>
-    </w:p>
-    <w:p>
-      <w:pPr>
-        <w:spacing w:line="360" w:lineRule="auto" w:before="0" w:after="120"/>
-      </w:pPr>
-      <w:r>
-        <w:rPr>
-          <w:rFonts w:ascii="Arial" w:hAnsi="Arial" w:eastAsia="맑은 고딕" w:cs="Arial"/>
-          <w:b w:val="0"/>
-          <w:sz w:val="22"/>
-        </w:rPr>
-        <w:t>#### ❌ 실수 5) 너무 많은 사업을 동시에 언급하는 경우</w:t>
-      </w:r>
-    </w:p>
-    <w:p>
-      <w:pPr>
-        <w:spacing w:line="360" w:lineRule="auto" w:before="0" w:after="120"/>
-      </w:pPr>
-      <w:r>
-        <w:rPr>
-          <w:rFonts w:ascii="Arial" w:hAnsi="Arial" w:eastAsia="맑은 고딕" w:cs="Arial"/>
-          <w:b w:val="0"/>
-          <w:sz w:val="22"/>
-        </w:rPr>
-        <w:t>"ㅇㅇ 사업도 좋고, ㅁㅁ 사업도 좋고, △△ 사업도 좋습니다." 이러시면 안 됩니다. 한 가지 사업을 깊게 말씀하시는 것이 훨씬 더 강력합니다. 욕심 내지 마시기 바랍니다.</w:t>
-      </w:r>
-    </w:p>
-    <w:p>
-      <w:pPr>
-        <w:spacing w:line="240" w:lineRule="auto" w:before="0" w:after="0"/>
-      </w:pPr>
-    </w:p>
-    <w:p>
-      <w:pPr>
-        <w:spacing w:line="240" w:lineRule="auto" w:before="0" w:after="0"/>
-        <w:jc w:val="center"/>
-        <w:pBdr>
-          <w:bottom w:val="single" w:sz="8" w:space="1" w:color="888888"/>
-        </w:pBdr>
-      </w:pPr>
-    </w:p>
-    <w:p>
-      <w:pPr>
-        <w:spacing w:line="240" w:lineRule="auto" w:before="0" w:after="0"/>
-      </w:pPr>
-    </w:p>
-    <w:p>
-      <w:pPr>
-        <w:spacing w:line="360" w:lineRule="auto" w:before="280" w:after="160"/>
-      </w:pPr>
-      <w:r>
-        <w:rPr>
-          <w:rFonts w:ascii="Arial" w:hAnsi="Arial" w:eastAsia="맑은 고딕" w:cs="Arial"/>
-          <w:b/>
-          <w:sz w:val="24"/>
-        </w:rPr>
-        <w:t>🎁 마무리 - 이 편 핵심 정리</w:t>
-      </w:r>
-    </w:p>
-    <w:p>
-      <w:pPr>
-        <w:spacing w:line="360" w:lineRule="auto" w:before="0" w:after="120"/>
-      </w:pPr>
-      <w:r>
-        <w:rPr>
-          <w:rFonts w:ascii="Arial" w:hAnsi="Arial" w:eastAsia="맑은 고딕" w:cs="Arial"/>
-          <w:b w:val="0"/>
-          <w:sz w:val="22"/>
-        </w:rPr>
-        <w:t>여러분, 이 질문은 "기관 이해도 + 본인 연결고리 + 기여 의지" 세 가지를 한 번에 보는 질문입니다. 다음 세 가지만 기억하시기 바랍니다.</w:t>
-      </w:r>
-    </w:p>
-    <w:p>
-      <w:pPr>
-        <w:spacing w:line="360" w:lineRule="auto" w:before="0" w:after="80"/>
-        <w:ind w:left="340"/>
-      </w:pPr>
-      <w:r>
-        <w:rPr>
-          <w:rFonts w:ascii="Arial" w:hAnsi="Arial" w:eastAsia="맑은 고딕" w:cs="Arial"/>
-          <w:b w:val="0"/>
-          <w:sz w:val="22"/>
-        </w:rPr>
-        <w:t>• 사업 선택 : 기관 핵심 사업(중장기계획/취임사) + 사회적 의의 + 본인 경험 연결, 셋 중 최소 2개 충족</w:t>
-      </w:r>
-    </w:p>
-    <w:p>
-      <w:pPr>
-        <w:spacing w:line="360" w:lineRule="auto" w:before="0" w:after="80"/>
-        <w:ind w:left="340"/>
-      </w:pPr>
-      <w:r>
-        <w:rPr>
-          <w:rFonts w:ascii="Arial" w:hAnsi="Arial" w:eastAsia="맑은 고딕" w:cs="Arial"/>
-          <w:b w:val="0"/>
-          <w:sz w:val="22"/>
-        </w:rPr>
-        <w:t>• 답변 프레임 : 두괄식(저는 ㅇㅇ 사업에 관심 있습니다) → 근거(경험/기관/사회이슈) → 기여(보태겠다/수행하겠다)</w:t>
-      </w:r>
-    </w:p>
-    <w:p>
-      <w:pPr>
-        <w:spacing w:line="360" w:lineRule="auto" w:before="0" w:after="80"/>
-        <w:ind w:left="340"/>
-      </w:pPr>
-      <w:r>
-        <w:rPr>
-          <w:rFonts w:ascii="Arial" w:hAnsi="Arial" w:eastAsia="맑은 고딕" w:cs="Arial"/>
-          <w:b w:val="0"/>
-          <w:sz w:val="22"/>
-        </w:rPr>
-        <w:t>• 마무리 톤 : "배우겠다/성장하겠다" 금지, "기여하겠다/보태겠다/수행하겠다" 로 마무리</w:t>
-      </w:r>
-    </w:p>
-    <w:p>
-      <w:pPr>
-        <w:spacing w:line="360" w:lineRule="auto" w:before="0" w:after="120"/>
-      </w:pPr>
-      <w:r>
-        <w:rPr>
-          <w:rFonts w:ascii="Arial" w:hAnsi="Arial" w:eastAsia="맑은 고딕" w:cs="Arial"/>
-          <w:b w:val="0"/>
-          <w:sz w:val="22"/>
-        </w:rPr>
-        <w:t>다음 편에서는 "우리 기관이 현재 직면한 위기와 기회는 무엇이라고 생각하는가" 라는 질문을 다루겠습니다. 이번 편의 "관심 사업" 질문과 짝을 이루는 핵심 질문이니 이어서 보시기 바랍니다.</w:t>
+        <w:t>다음 편에서는 "우리 기관의 위기와 기회는 무엇이라고 생각하는가" 질문을 다루겠습니다. 관심 사업 질문과 한 세트로 묶이는 단골 질문이니 꼭 이어서 보시기 바랍니다.</w:t>
       </w:r>
     </w:p>
     <w:p>

</xml_diff>